<commit_message>
Élèves : l'élève responsable voit son OR ; accès limité à ses propres OR
- Règle unique OrdreReparation.filtre_eleve (créateur, élève responsable, intervention)
  utilisée pour la liste, le tableau de bord et la fiche OR
- Fiche OR : un élève ne peut plus ouvrir un OR qui ne lui est pas attribué
- Tableau de bord élève : alertes et OR par véhicule limités à ses OR
- Manuels mis à jour

Co-Authored-By: Claude Opus 5 <noreply@anthropic.com>
</commit_message>
<xml_diff>
--- a/docs/Manuel_Enseignant_MECA_AUTO.docx
+++ b/docs/Manuel_Enseignant_MECA_AUTO.docx
@@ -2139,12 +2139,12 @@
         <w:tc>
           <w:tcPr>
             <w:tcW w:type="dxa" w:w="9972"/>
-            <w:shd w:val="clear" w:color="auto" w:fill="E8F5E9"/>
+            <w:shd w:val="clear" w:color="auto" w:fill="E3F2FD"/>
             <w:tcBorders>
-              <w:top w:val="single" w:sz="6" w:color="A5D6A7"/>
-              <w:left w:val="single" w:sz="6" w:color="A5D6A7"/>
-              <w:bottom w:val="single" w:sz="6" w:color="A5D6A7"/>
-              <w:right w:val="single" w:sz="6" w:color="A5D6A7"/>
+              <w:top w:val="single" w:sz="6" w:color="90CAF9"/>
+              <w:left w:val="single" w:sz="6" w:color="90CAF9"/>
+              <w:bottom w:val="single" w:sz="6" w:color="90CAF9"/>
+              <w:right w:val="single" w:sz="6" w:color="90CAF9"/>
             </w:tcBorders>
           </w:tcPr>
           <w:p>
@@ -2152,19 +2152,31 @@
               <w:rPr>
                 <w:b w:val="0"/>
               </w:rPr>
-              <w:t xml:space="preserve">💡 Un élève voit dans sa liste les OR </w:t>
+              <w:t>ℹ️ Un élève voit uniquement les OR dont il est l'</w:t>
             </w:r>
             <w:r>
               <w:rPr>
                 <w:b/>
               </w:rPr>
-              <w:t>sur lesquels il a une intervention</w:t>
+              <w:t>élève responsable</w:t>
             </w:r>
             <w:r>
               <w:rPr>
                 <w:b w:val="0"/>
               </w:rPr>
-              <w:t>. Pour qu'un élève retrouve un OR, ajoutez-lui une première intervention.</w:t>
+              <w:t xml:space="preserve"> ou sur lesquels il a une </w:t>
+            </w:r>
+            <w:r>
+              <w:rPr>
+                <w:b/>
+              </w:rPr>
+              <w:t>intervention</w:t>
+            </w:r>
+            <w:r>
+              <w:rPr>
+                <w:b w:val="0"/>
+              </w:rPr>
+              <w:t>. Il ne peut pas ouvrir les autres.</w:t>
             </w:r>
           </w:p>
         </w:tc>
@@ -3823,7 +3835,19 @@
         <w:rPr>
           <w:b w:val="0"/>
         </w:rPr>
-        <w:t xml:space="preserve"> sur cet OR (voir partie 5).</w:t>
+        <w:t xml:space="preserve"> sur cet OR. À la création d'un OR, choisir l'élève comme </w:t>
+      </w:r>
+      <w:r>
+        <w:rPr>
+          <w:b/>
+        </w:rPr>
+        <w:t>élève responsable</w:t>
+      </w:r>
+      <w:r>
+        <w:rPr>
+          <w:b w:val="0"/>
+        </w:rPr>
+        <w:t xml:space="preserve"> le lui rend visible directement.</w:t>
       </w:r>
     </w:p>
     <w:p>

</xml_diff>